<commit_message>
updated purchase order skill
</commit_message>
<xml_diff>
--- a/implementation_layer/no-code-assets/agent-skills/purchase-order-processing/sample_data/sample_sales_order/sample_order.docx
+++ b/implementation_layer/no-code-assets/agent-skills/purchase-order-processing/sample_data/sample_sales_order/sample_order.docx
@@ -1295,8 +1295,8 @@
         <w:tblLook w:val="0000" w:firstRow="0" w:lastRow="0" w:firstColumn="0" w:lastColumn="0" w:noHBand="0" w:noVBand="0"/>
       </w:tblPr>
       <w:tblGrid>
-        <w:gridCol w:w="3532"/>
-        <w:gridCol w:w="1867"/>
+        <w:gridCol w:w="3472"/>
+        <w:gridCol w:w="1927"/>
       </w:tblGrid>
       <w:tr>
         <w:tc>
@@ -1335,7 +1335,21 @@
                 <w:sz w:val="20"/>
                 <w:szCs w:val="20"/>
               </w:rPr>
-              <w:t>$25567.50</w:t>
+              <w:t>$25</w:t>
+            </w:r>
+            <w:r>
+              <w:rPr>
+                <w:sz w:val="20"/>
+                <w:szCs w:val="20"/>
+              </w:rPr>
+              <w:t>,</w:t>
+            </w:r>
+            <w:r>
+              <w:rPr>
+                <w:sz w:val="20"/>
+                <w:szCs w:val="20"/>
+              </w:rPr>
+              <w:t>567.50</w:t>
             </w:r>
           </w:p>
         </w:tc>
@@ -1377,7 +1391,21 @@
                 <w:sz w:val="20"/>
                 <w:szCs w:val="20"/>
               </w:rPr>
-              <w:t>-$1278.38</w:t>
+              <w:t>-$1</w:t>
+            </w:r>
+            <w:r>
+              <w:rPr>
+                <w:sz w:val="20"/>
+                <w:szCs w:val="20"/>
+              </w:rPr>
+              <w:t>,</w:t>
+            </w:r>
+            <w:r>
+              <w:rPr>
+                <w:sz w:val="20"/>
+                <w:szCs w:val="20"/>
+              </w:rPr>
+              <w:t>278.38</w:t>
             </w:r>
           </w:p>
         </w:tc>
@@ -1419,7 +1447,21 @@
                 <w:sz w:val="20"/>
                 <w:szCs w:val="20"/>
               </w:rPr>
-              <w:t>$24289.13</w:t>
+              <w:t>$24</w:t>
+            </w:r>
+            <w:r>
+              <w:rPr>
+                <w:sz w:val="20"/>
+                <w:szCs w:val="20"/>
+              </w:rPr>
+              <w:t>,</w:t>
+            </w:r>
+            <w:r>
+              <w:rPr>
+                <w:sz w:val="20"/>
+                <w:szCs w:val="20"/>
+              </w:rPr>
+              <w:t>289.13</w:t>
             </w:r>
           </w:p>
         </w:tc>
@@ -1545,7 +1587,21 @@
                 <w:sz w:val="20"/>
                 <w:szCs w:val="20"/>
               </w:rPr>
-              <w:t>$1494.25</w:t>
+              <w:t>$1</w:t>
+            </w:r>
+            <w:r>
+              <w:rPr>
+                <w:sz w:val="20"/>
+                <w:szCs w:val="20"/>
+              </w:rPr>
+              <w:t>,</w:t>
+            </w:r>
+            <w:r>
+              <w:rPr>
+                <w:sz w:val="20"/>
+                <w:szCs w:val="20"/>
+              </w:rPr>
+              <w:t>494.25</w:t>
             </w:r>
           </w:p>
         </w:tc>
@@ -1575,7 +1631,21 @@
                 <w:b/>
                 <w:bCs/>
               </w:rPr>
-              <w:t>$26398.37</w:t>
+              <w:t>$26</w:t>
+            </w:r>
+            <w:r>
+              <w:rPr>
+                <w:b/>
+                <w:bCs/>
+              </w:rPr>
+              <w:t>,</w:t>
+            </w:r>
+            <w:r>
+              <w:rPr>
+                <w:b/>
+                <w:bCs/>
+              </w:rPr>
+              <w:t>398.37</w:t>
             </w:r>
           </w:p>
         </w:tc>

</xml_diff>